<commit_message>
fix(one-pager): stray literal asterisks in the Word copy (converter handles bold, not italics)
</commit_message>
<xml_diff>
--- a/docs/one-pager.docx
+++ b/docs/one-pager.docx
@@ -44,7 +44,16 @@
         <w:t xml:space="preserve">Made for</w:t>
       </w:r>
       <w:r>
-        <w:t xml:space="preserve"> *Demon*, a ~20-minute AIGC short (18 scenes, 210 shots)</w:t>
+        <w:t xml:space="preserve"> </w:t>
+      </w:r>
+      <w:r>
+        <w:rPr>
+          <w:b/>
+        </w:rPr>
+        <w:t xml:space="preserve">Demon</w:t>
+      </w:r>
+      <w:r>
+        <w:t xml:space="preserve">, a ~20-minute AIGC short (18 scenes, 210 shots)</w:t>
       </w:r>
     </w:p>
     <w:p>
@@ -135,7 +144,16 @@
         <w:rPr>
           <w:b/>
         </w:rPr>
-        <w:t xml:space="preserve">What it produced on *Demon*.</w:t>
+        <w:t xml:space="preserve">What it produced on </w:t>
+      </w:r>
+      <w:r>
+        <w:t xml:space="preserve">Demon</w:t>
+      </w:r>
+      <w:r>
+        <w:rPr>
+          <w:b/>
+        </w:rPr>
+        <w:t xml:space="preserve">.</w:t>
       </w:r>
       <w:r>
         <w:t xml:space="preserve"> A shot index of </w:t>
@@ -212,7 +230,16 @@
         <w:t xml:space="preserve">Reverse locks.</w:t>
       </w:r>
       <w:r>
-        <w:t xml:space="preserve"> Every prompt names what must *not* happen. About half of my rework traced back to a missing lock.</w:t>
+        <w:t xml:space="preserve"> Every prompt names what must </w:t>
+      </w:r>
+      <w:r>
+        <w:rPr>
+          <w:b/>
+        </w:rPr>
+        <w:t xml:space="preserve">not</w:t>
+      </w:r>
+      <w:r>
+        <w:t xml:space="preserve"> happen. About half of my rework traced back to a missing lock.</w:t>
       </w:r>
     </w:p>
     <w:p>

</xml_diff>

<commit_message>
fix(one-pager): closing note as a plain paragraph — no stray asterisks in the printed copy
</commit_message>
<xml_diff>
--- a/docs/one-pager.docx
+++ b/docs/one-pager.docx
@@ -309,12 +309,18 @@
     </w:p>
     <w:p>
       <w:r>
-        <w:t xml:space="preserve">*One page. Export to PDF from `docs/one-pager.docx` (or print to PDF). Fill the three `&lt;...&gt;` links</w:t>
-      </w:r>
-    </w:p>
-    <w:p>
-      <w:r>
-        <w:t xml:space="preserve">before submitting.*</w:t>
+        <w:rPr>
+          <w:b/>
+        </w:rPr>
+        <w:t xml:space="preserve">Note.</w:t>
+      </w:r>
+      <w:r>
+        <w:t xml:space="preserve"> One page. Export to PDF from `docs/one-pager.docx` (or print to PDF). Fill the three</w:t>
+      </w:r>
+    </w:p>
+    <w:p>
+      <w:r>
+        <w:t xml:space="preserve">`&lt;...&gt;` links before submitting.</w:t>
       </w:r>
     </w:p>
     <w:sectPr>

</xml_diff>

<commit_message>
scope: one-pager links to the repo only; private-first then public at submission
</commit_message>
<xml_diff>
--- a/docs/one-pager.docx
+++ b/docs/one-pager.docx
@@ -299,12 +299,7 @@
         <w:t xml:space="preserve">Links.</w:t>
       </w:r>
       <w:r>
-        <w:t xml:space="preserve"> Repository: `&lt;repo link&gt;` · Case study (PDF): `&lt;case study link&gt;` ·</w:t>
-      </w:r>
-    </w:p>
-    <w:p>
-      <w:r>
-        <w:t xml:space="preserve">60-second walkthrough: `&lt;video link&gt;`</w:t>
+        <w:t xml:space="preserve"> Repository: `&lt;repo link&gt;` — private now; made public before submission.</w:t>
       </w:r>
     </w:p>
     <w:p>

</xml_diff>